<commit_message>
Add GitHub repository link to proposal
Co-authored-by: Copilot <223556219+Copilot@users.noreply.github.com>
</commit_message>
<xml_diff>
--- a/Project Proposal - Rural Smart Supply Chain Management System - Updated.docx
+++ b/Project Proposal - Rural Smart Supply Chain Management System - Updated.docx
@@ -2,6 +2,16 @@
 <file path=word/document.xml><?xml version="1.0" encoding="utf-8"?>
 <w:document xmlns:mc="http://schemas.openxmlformats.org/markup-compatibility/2006" xmlns:o="urn:schemas-microsoft-com:office:office" xmlns:r="http://schemas.openxmlformats.org/officeDocument/2006/relationships" xmlns:m="http://schemas.openxmlformats.org/officeDocument/2006/math" xmlns:v="urn:schemas-microsoft-com:vml" xmlns:wp="http://schemas.openxmlformats.org/drawingml/2006/wordprocessingDrawing" xmlns:w10="urn:schemas-microsoft-com:office:word" xmlns:w="http://schemas.openxmlformats.org/wordprocessingml/2006/main" xmlns:wne="http://schemas.microsoft.com/office/word/2006/wordml" xmlns:sl="http://schemas.openxmlformats.org/schemaLibrary/2006/main" xmlns:a="http://schemas.openxmlformats.org/drawingml/2006/main" xmlns:pic="http://schemas.openxmlformats.org/drawingml/2006/picture" xmlns:c="http://schemas.openxmlformats.org/drawingml/2006/chart" xmlns:lc="http://schemas.openxmlformats.org/drawingml/2006/lockedCanvas" xmlns:dgm="http://schemas.openxmlformats.org/drawingml/2006/diagram" xmlns:wps="http://schemas.microsoft.com/office/word/2010/wordprocessingShape" xmlns:wpg="http://schemas.microsoft.com/office/word/2010/wordprocessingGroup" xmlns:w14="http://schemas.microsoft.com/office/word/2010/wordml" xmlns:w15="http://schemas.microsoft.com/office/word/2012/wordml" xmlns:w16="http://schemas.microsoft.com/office/word/2018/wordml" xmlns:w16cex="http://schemas.microsoft.com/office/word/2018/wordml/cex" xmlns:w16cid="http://schemas.microsoft.com/office/word/2016/wordml/cid" xmlns="http://schemas.microsoft.com/office/tasks/2019/documenttasks" xmlns:cr="http://schemas.microsoft.com/office/comments/2020/reactions">
   <w:body>
+    <w:p>
+      <w:r>
+        <w:rPr>
+          <w:color w:val="1F6FEB"/>
+          <w:sz w:val="20"/>
+          <w:u w:val="single"/>
+        </w:rPr>
+        <w:t>GitHub Repository: https://github.com/vesperhalcro-oss/Smart-Supply-Chain-Management-For-Rural-Area</w:t>
+      </w:r>
+    </w:p>
     <w:p>
       <w:pPr>
         <w:pStyle w:val="Heading1"/>
@@ -1641,6 +1651,24 @@
       </w:pPr>
       <w:r>
         <w:t>Figure 4.7: Implemented parcel tracking screen with search, live status, custody events, ETA, and condition score.</w:t>
+      </w:r>
+    </w:p>
+    <w:p>
+      <w:pPr>
+        <w:spacing w:before="200" w:after="80"/>
+      </w:pPr>
+      <w:r>
+        <w:rPr>
+          <w:b/>
+        </w:rPr>
+        <w:t xml:space="preserve">Project repository: </w:t>
+      </w:r>
+      <w:r>
+        <w:rPr>
+          <w:color w:val="1F6FEB"/>
+          <w:u w:val="single"/>
+        </w:rPr>
+        <w:t>https://github.com/vesperhalcro-oss/Smart-Supply-Chain-Management-For-Rural-Area</w:t>
       </w:r>
     </w:p>
     <w:sectPr>

</xml_diff>